<commit_message>
Post-copyedit pass: restore meaning where the language edit changed it
The Rubriq edit is kept (US spelling, tightened phrasing). Twenty-six places
where it altered the science or broke a mechanism are corrected, including a
DOI with a space in it and an Americanised reference title.

Co-Authored-By: Claude Opus 5 <noreply@anthropic.com>
</commit_message>
<xml_diff>
--- a/manuscript/BioEssays_Cover_Letter_Sandler.docx
+++ b/manuscript/BioEssays_Cover_Letter_Sandler.docx
@@ -107,7 +107,7 @@
           <w:b w:val="0"/>
           <w:sz w:val="22"/>
         </w:rPr>
-        <w:t>The central proposal is that DNA-repair fidelity is not simply a determinant of mutation rate but a control parameter governing whether multicellular tissue remains in a stable cooperative state. The recent demonstration that the bowhead whale resists cancer through enhanced and accurate repair rather than through additional tumour-suppressor barriers (Firsanov et al., Nature, 2025) is the empirical entry point, but the hypothesis is general: it asks whether cancer resistance and age-associated tissue decline are two readouts of a single repair parameter rather than two traits that happen to co-occur.</w:t>
+        <w:t>The central proposal is that DNA-repair fidelity is not simply a determinant of mutation rate but a control parameter governing whether multicellular tissue remains in a stable cooperative state. The recent demonstration that the bowhead whale resists cancer through enhanced and accurate repair rather than through additional tumor-suppressor barriers (Firsanov et al., Nature, 2025) is the empirical entry point, but the hypothesis is general: it asks whether cancer resistance and age-associated tissue decline are two readouts of a single repair parameter rather than two traits that happen to co-occur.</w:t>
       </w:r>
     </w:p>
     <w:p>
@@ -131,7 +131,7 @@
           <w:b w:val="0"/>
           <w:sz w:val="22"/>
         </w:rPr>
-        <w:t>The paper is a conceptual framework with explicit predictions rather than a report of new data, and it engages a question of broad interest across cancer biology, ageing research and comparative physiology. It also makes a point of separating what is published, what the model contributes as interpretation, and what remains speculation — a distinction carried through a dedicated table and repeated in the limitations. BioEssays has published closely related conceptual work on the atavistic model of cancer, to which this hypothesis is compatible but which it deliberately does not require.</w:t>
+        <w:t>The paper is a conceptual framework with explicit predictions rather than a report of new data, and it engages a question of broad interest across cancer biology, aging research and comparative physiology. It also makes a point of separating what is published, what the model contributes as interpretation, and what remains speculation — a distinction carried through a dedicated table and repeated in the limitations. BioEssays has published closely related conceptual work on the atavistic model of cancer, to which this hypothesis is compatible but which it deliberately does not require.</w:t>
       </w:r>
     </w:p>
     <w:p>
@@ -191,7 +191,7 @@
         <w:rPr>
           <w:sz w:val="22"/>
         </w:rPr>
-        <w:t>The magnitude does depend on implementation, by roughly twofold — and enhancement confined to constitutive repair abolishes bistability above a threshold multiplier of 2.60, converting catastrophic collapse into graded decline. This was not anticipated, and it turns a modelling detail into a measurable prediction that discriminates between mechanisms.</w:t>
+        <w:t>The magnitude does depend on implementation, by roughly twofold — and enhancement confined to constitutive repair abolishes bistability above a threshold multiplier of 2.60, converting catastrophic collapse into graded decline. This was not anticipated, and it turns a modeling detail into a measurable prediction that discriminates between mechanisms.</w:t>
       </w:r>
     </w:p>
     <w:p>

</xml_diff>